<commit_message>
docs(paper): Revise Chapter 1, add Chapter 2 methodology
Updates the introduction, adds the methodology chapter, and refreshes
the compiled manuscript to match.

Co-Authored-By: Claude Opus 5.5 <noreply@anthropic.com>
</commit_message>
<xml_diff>
--- a/KasiGuru_ A Gamified Mobile Learning Application for the Preservation and Learning of the Kasiguranin Dialect.docx
+++ b/KasiGuru_ A Gamified Mobile Learning Application for the Preservation and Learning of the Kasiguranin Dialect.docx
@@ -591,6 +591,273 @@
           <w:rtl w:val="0"/>
         </w:rPr>
         <w:t xml:space="preserve">Kasiguranin features a complex morphological system where verbs are inflected for aspect rather than chronological tense. Younger speakers increasingly replace these rules with Tagalog code-switching. Mobile learning (m-learning) combined with gamification mechanics (rewards, quizzes, progression tracking) offers a proven framework to boost motivation. KasiGuru translates Kasiguranin’s grammar sketch into an accessible digital repository to foster language preservation.</w:t>
+      </w:r>
+    </w:p>
+    <w:p>
+      <w:pPr>
+        <w:pStyle w:val="Heading2"/>
+        <w:keepNext w:val="0"/>
+        <w:keepLines w:val="0"/>
+        <w:pBdr>
+          <w:top w:color="auto" w:space="0" w:sz="0" w:val="none"/>
+          <w:left w:color="auto" w:space="0" w:sz="0" w:val="none"/>
+          <w:bottom w:color="auto" w:space="0" w:sz="0" w:val="none"/>
+          <w:right w:color="auto" w:space="0" w:sz="0" w:val="none"/>
+          <w:between w:color="auto" w:space="0" w:sz="0" w:val="none"/>
+        </w:pBdr>
+        <w:spacing w:after="200" w:before="0" w:line="480" w:lineRule="auto"/>
+        <w:jc w:val="both"/>
+        <w:rPr>
+          <w:rFonts w:ascii="Times New Roman" w:cs="Times New Roman" w:eastAsia="Times New Roman" w:hAnsi="Times New Roman"/>
+          <w:b w:val="1"/>
+          <w:bCs w:val="1"/>
+          <w:color w:val="1f1f1f"/>
+          <w:sz w:val="24"/>
+          <w:szCs w:val="24"/>
+        </w:rPr>
+      </w:pPr>
+      <w:bookmarkStart w:colFirst="0" w:colLast="0" w:name="_cf1conceptualframework" w:id="100"/>
+      <w:bookmarkEnd w:id="100"/>
+      <w:r>
+        <w:rPr>
+          <w:rFonts w:ascii="Times New Roman" w:cs="Times New Roman" w:eastAsia="Times New Roman" w:hAnsi="Times New Roman"/>
+          <w:b w:val="1"/>
+          <w:bCs w:val="1"/>
+          <w:color w:val="1f1f1f"/>
+          <w:sz w:val="24"/>
+          <w:szCs w:val="24"/>
+          <w:rtl w:val="0"/>
+        </w:rPr>
+        <w:t xml:space="preserve">CONCEPTUAL FRAMEWORK</w:t>
+      </w:r>
+    </w:p>
+    <w:p>
+      <w:pPr>
+        <w:pBdr>
+          <w:top w:color="auto" w:space="0" w:sz="0" w:val="none"/>
+          <w:left w:color="auto" w:space="0" w:sz="0" w:val="none"/>
+          <w:bottom w:color="auto" w:space="0" w:sz="0" w:val="none"/>
+          <w:right w:color="auto" w:space="0" w:sz="0" w:val="none"/>
+          <w:between w:color="auto" w:space="0" w:sz="0" w:val="none"/>
+        </w:pBdr>
+        <w:spacing w:after="200" w:line="480" w:lineRule="auto"/>
+        <w:jc w:val="both"/>
+        <w:rPr>
+          <w:rFonts w:ascii="Times New Roman" w:cs="Times New Roman" w:eastAsia="Times New Roman" w:hAnsi="Times New Roman"/>
+          <w:color w:val="1f1f1f"/>
+          <w:sz w:val="24"/>
+          <w:szCs w:val="24"/>
+        </w:rPr>
+      </w:pPr>
+      <w:r>
+        <w:rPr>
+          <w:rFonts w:ascii="Times New Roman" w:cs="Times New Roman" w:eastAsia="Times New Roman" w:hAnsi="Times New Roman"/>
+          <w:color w:val="1f1f1f"/>
+          <w:sz w:val="24"/>
+          <w:szCs w:val="24"/>
+          <w:rtl w:val="0"/>
+        </w:rPr>
+        <w:t xml:space="preserve">This study adopts the Input–Process–Output (IPO) model as its conceptual framework, extended with a feedback path, because the study is a development study that transforms identified resources and requirements into a software artifact and an evaluation of that artifact.</w:t>
+      </w:r>
+    </w:p>
+    <w:p>
+      <w:pPr>
+        <w:pBdr>
+          <w:top w:color="auto" w:space="0" w:sz="0" w:val="none"/>
+          <w:left w:color="auto" w:space="0" w:sz="0" w:val="none"/>
+          <w:bottom w:color="auto" w:space="0" w:sz="0" w:val="none"/>
+          <w:right w:color="auto" w:space="0" w:sz="0" w:val="none"/>
+          <w:between w:color="auto" w:space="0" w:sz="0" w:val="none"/>
+        </w:pBdr>
+        <w:spacing w:after="200" w:line="480" w:lineRule="auto"/>
+        <w:jc w:val="both"/>
+        <w:rPr>
+          <w:rFonts w:ascii="Times New Roman" w:cs="Times New Roman" w:eastAsia="Times New Roman" w:hAnsi="Times New Roman"/>
+          <w:color w:val="1f1f1f"/>
+          <w:sz w:val="24"/>
+          <w:szCs w:val="24"/>
+        </w:rPr>
+      </w:pPr>
+      <w:r>
+        <w:rPr>
+          <w:rFonts w:ascii="Times New Roman" w:cs="Times New Roman" w:eastAsia="Times New Roman" w:hAnsi="Times New Roman"/>
+          <w:color w:val="1f1f1f"/>
+          <w:sz w:val="24"/>
+          <w:szCs w:val="24"/>
+          <w:rtl w:val="0"/>
+        </w:rPr>
+        <w:t xml:space="preserve">Input comprises the raw material and the constraints: Supnet's (2016) grammatical sketch of Kasiguranin; vocabulary and narratives elicited from community speakers and culture bearers; the needs of student and beginner learners and of educators in Casiguran; the ISO/IEC 25010 quality characteristics; and the target Android platform and connectivity conditions of the deployment site.</w:t>
+      </w:r>
+    </w:p>
+    <w:p>
+      <w:pPr>
+        <w:pBdr>
+          <w:top w:color="auto" w:space="0" w:sz="0" w:val="none"/>
+          <w:left w:color="auto" w:space="0" w:sz="0" w:val="none"/>
+          <w:bottom w:color="auto" w:space="0" w:sz="0" w:val="none"/>
+          <w:right w:color="auto" w:space="0" w:sz="0" w:val="none"/>
+          <w:between w:color="auto" w:space="0" w:sz="0" w:val="none"/>
+        </w:pBdr>
+        <w:spacing w:after="200" w:line="480" w:lineRule="auto"/>
+        <w:jc w:val="both"/>
+        <w:rPr>
+          <w:rFonts w:ascii="Times New Roman" w:cs="Times New Roman" w:eastAsia="Times New Roman" w:hAnsi="Times New Roman"/>
+          <w:color w:val="1f1f1f"/>
+          <w:sz w:val="24"/>
+          <w:szCs w:val="24"/>
+        </w:rPr>
+      </w:pPr>
+      <w:r>
+        <w:rPr>
+          <w:rFonts w:ascii="Times New Roman" w:cs="Times New Roman" w:eastAsia="Times New Roman" w:hAnsi="Times New Roman"/>
+          <w:color w:val="1f1f1f"/>
+          <w:sz w:val="24"/>
+          <w:szCs w:val="24"/>
+          <w:rtl w:val="0"/>
+        </w:rPr>
+        <w:t xml:space="preserve">Process comprises the Phased Development Approach—requirements, analysis, design, coding/implementation, testing, deployment, and maintenance—within which five design mechanisms operate on the input: digitization and semantic categorization of the lexicon; scheduling of review by a spaced-repetition algorithm; application of gamification mechanics for persistence; an offline-first data architecture with opportunistic synchronization; and development of the accompanying administrative web portal for corpus management, submission moderation, and release publishing. The process concludes with evaluation against ISO/IEC 25010 and an acceptability survey administered to the target users.</w:t>
+      </w:r>
+    </w:p>
+    <w:p>
+      <w:pPr>
+        <w:pBdr>
+          <w:top w:color="auto" w:space="0" w:sz="0" w:val="none"/>
+          <w:left w:color="auto" w:space="0" w:sz="0" w:val="none"/>
+          <w:bottom w:color="auto" w:space="0" w:sz="0" w:val="none"/>
+          <w:right w:color="auto" w:space="0" w:sz="0" w:val="none"/>
+          <w:between w:color="auto" w:space="0" w:sz="0" w:val="none"/>
+        </w:pBdr>
+        <w:spacing w:after="200" w:line="480" w:lineRule="auto"/>
+        <w:jc w:val="both"/>
+        <w:rPr>
+          <w:rFonts w:ascii="Times New Roman" w:cs="Times New Roman" w:eastAsia="Times New Roman" w:hAnsi="Times New Roman"/>
+          <w:color w:val="1f1f1f"/>
+          <w:sz w:val="24"/>
+          <w:szCs w:val="24"/>
+        </w:rPr>
+      </w:pPr>
+      <w:r>
+        <w:rPr>
+          <w:rFonts w:ascii="Times New Roman" w:cs="Times New Roman" w:eastAsia="Times New Roman" w:hAnsi="Times New Roman"/>
+          <w:color w:val="1f1f1f"/>
+          <w:sz w:val="24"/>
+          <w:szCs w:val="24"/>
+          <w:rtl w:val="0"/>
+        </w:rPr>
+        <w:t xml:space="preserve">Output comprises the developed KasiGuru mobile application, distributed as a directly installed Android package; the administrative web portal used to manage the corpus, moderate community submissions, and publish releases; the digitized Kasiguranin lexical corpus and narrative collection as a preservation artifact in its own right; the resulting software quality evaluation; and the measured level of user acceptability.</w:t>
+      </w:r>
+    </w:p>
+    <w:p>
+      <w:pPr>
+        <w:pBdr>
+          <w:top w:color="auto" w:space="0" w:sz="0" w:val="none"/>
+          <w:left w:color="auto" w:space="0" w:sz="0" w:val="none"/>
+          <w:bottom w:color="auto" w:space="0" w:sz="0" w:val="none"/>
+          <w:right w:color="auto" w:space="0" w:sz="0" w:val="none"/>
+          <w:between w:color="auto" w:space="0" w:sz="0" w:val="none"/>
+        </w:pBdr>
+        <w:spacing w:after="200" w:line="480" w:lineRule="auto"/>
+        <w:jc w:val="both"/>
+        <w:rPr>
+          <w:rFonts w:ascii="Times New Roman" w:cs="Times New Roman" w:eastAsia="Times New Roman" w:hAnsi="Times New Roman"/>
+          <w:color w:val="1f1f1f"/>
+          <w:sz w:val="24"/>
+          <w:szCs w:val="24"/>
+        </w:rPr>
+      </w:pPr>
+      <w:r>
+        <w:rPr>
+          <w:rFonts w:ascii="Times New Roman" w:cs="Times New Roman" w:eastAsia="Times New Roman" w:hAnsi="Times New Roman"/>
+          <w:color w:val="1f1f1f"/>
+          <w:sz w:val="24"/>
+          <w:szCs w:val="24"/>
+          <w:rtl w:val="0"/>
+        </w:rPr>
+        <w:t xml:space="preserve">The feedback path distinguishes this framework from a linear development model. Evaluation results and usability findings re-enter the process as revised requirements, and the application's moderated contribution pipeline returns new linguistic data to the input as community members submit Kasiguranin words that, after expert review, enter the corpus. The corpus is therefore not a fixed input consumed once but a living resource the community extends.</w:t>
+      </w:r>
+    </w:p>
+    <w:p>
+      <w:pPr>
+        <w:pBdr>
+          <w:top w:color="auto" w:space="0" w:sz="0" w:val="none"/>
+          <w:left w:color="auto" w:space="0" w:sz="0" w:val="none"/>
+          <w:bottom w:color="auto" w:space="0" w:sz="0" w:val="none"/>
+          <w:right w:color="auto" w:space="0" w:sz="0" w:val="none"/>
+          <w:between w:color="auto" w:space="0" w:sz="0" w:val="none"/>
+        </w:pBdr>
+        <w:spacing w:after="200" w:line="480" w:lineRule="auto"/>
+        <w:jc w:val="center"/>
+      </w:pPr>
+      <w:r>
+        <w:rPr>
+          <w:rFonts w:ascii="Times New Roman" w:cs="Times New Roman" w:eastAsia="Times New Roman" w:hAnsi="Times New Roman"/>
+        </w:rPr>
+        <w:drawing>
+          <wp:inline distT="0" distB="0" distL="0" distR="0">
+            <wp:extent cx="5760720" cy="1977847"/>
+            <wp:effectExtent l="0" t="0" r="0" b="0"/>
+            <wp:docPr id="1" name="Figure 1" descr="Conceptual framework of the study: Input, Process, Output model with feedback loop"/>
+            <wp:cNvGraphicFramePr>
+              <a:graphicFrameLocks xmlns:a="http://schemas.openxmlformats.org/drawingml/2006/main" noChangeAspect="1"/>
+            </wp:cNvGraphicFramePr>
+            <a:graphic xmlns:a="http://schemas.openxmlformats.org/drawingml/2006/main">
+              <a:graphicData uri="http://schemas.openxmlformats.org/drawingml/2006/picture">
+                <pic:pic xmlns:pic="http://schemas.openxmlformats.org/drawingml/2006/picture">
+                  <pic:nvPicPr>
+                    <pic:cNvPr id="1" name="Figure 1"/>
+                    <pic:cNvPicPr/>
+                  </pic:nvPicPr>
+                  <pic:blipFill>
+                    <a:blip xmlns:r="http://schemas.openxmlformats.org/officeDocument/2006/relationships" r:embed="rId100"/>
+                    <a:stretch>
+                      <a:fillRect/>
+                    </a:stretch>
+                  </pic:blipFill>
+                  <pic:spPr>
+                    <a:xfrm>
+                      <a:off x="0" y="0"/>
+                      <a:ext cx="5760720" cy="1977847"/>
+                    </a:xfrm>
+                    <a:prstGeom prst="rect">
+                      <a:avLst/>
+                    </a:prstGeom>
+                  </pic:spPr>
+                </pic:pic>
+              </a:graphicData>
+            </a:graphic>
+          </wp:inline>
+        </w:drawing>
+      </w:r>
+    </w:p>
+    <w:p>
+      <w:pPr>
+        <w:pBdr>
+          <w:top w:color="auto" w:space="0" w:sz="0" w:val="none"/>
+          <w:left w:color="auto" w:space="0" w:sz="0" w:val="none"/>
+          <w:bottom w:color="auto" w:space="0" w:sz="0" w:val="none"/>
+          <w:right w:color="auto" w:space="0" w:sz="0" w:val="none"/>
+          <w:between w:color="auto" w:space="0" w:sz="0" w:val="none"/>
+        </w:pBdr>
+        <w:spacing w:after="200" w:line="480" w:lineRule="auto"/>
+        <w:jc w:val="center"/>
+        <w:rPr>
+          <w:rFonts w:ascii="Times New Roman" w:cs="Times New Roman" w:eastAsia="Times New Roman" w:hAnsi="Times New Roman"/>
+          <w:color w:val="1f1f1f"/>
+          <w:sz w:val="24"/>
+          <w:szCs w:val="24"/>
+        </w:rPr>
+      </w:pPr>
+      <w:r>
+        <w:rPr>
+          <w:rFonts w:ascii="Times New Roman" w:cs="Times New Roman" w:eastAsia="Times New Roman" w:hAnsi="Times New Roman"/>
+          <w:color w:val="1f1f1f"/>
+          <w:sz w:val="24"/>
+          <w:szCs w:val="24"/>
+          <w:b w:val="1"/>
+          <w:bCs w:val="1"/>
+          <w:rtl w:val="0"/>
+        </w:rPr>
+        <w:t xml:space="preserve">Figure 1. Conceptual framework of the study.</w:t>
       </w:r>
     </w:p>
     <w:p>

</xml_diff>